<commit_message>
Corrige os vínculos das tags e encurta o nome do Recrutamento
O código 0447CF9D012289 passa para o Analítico, que era o totem a que
ele pertencia; Treinamentos fica com o 0467929B012289. Remove também o
código antigo de Colaboradores, que tinha dois.

Com isso são 17 códigos, com os 15 módulos e os 2 quizzes cobertos e
nenhum alvo repetido.

Recrutamento e Seleção passa a se chamar apenas Recrutamento, mantendo
o identificador recrutamento-selecao.

Atualiza o documento do robô com os nomes e módulos atuais.

Co-Authored-By: Claude Opus 5 <noreply@anthropic.com>
</commit_message>
<xml_diff>
--- a/Maestro - Conteudo para o robo.docx
+++ b/Maestro - Conteudo para o robo.docx
@@ -1764,7 +1764,7 @@
         <w:spacing w:after="140" w:before="280"/>
       </w:pPr>
       <w:r>
-        <w:t xml:space="preserve">10. Recrutamento e Seleção</w:t>
+        <w:t xml:space="preserve">10. Recrutamento</w:t>
       </w:r>
     </w:p>
     <w:p>
@@ -2817,7 +2817,7 @@
           <w:b/>
           <w:bCs/>
         </w:rPr>
-        <w:t xml:space="preserve">Diagnóstico da Operação</w:t>
+        <w:t xml:space="preserve">Diagnóstico</w:t>
       </w:r>
     </w:p>
     <w:p>
@@ -6719,7 +6719,7 @@
           <w:b/>
           <w:bCs/>
         </w:rPr>
-        <w:t xml:space="preserve">Maestro sob Medida</w:t>
+        <w:t xml:space="preserve">Maestro Fit</w:t>
       </w:r>
     </w:p>
     <w:p>
@@ -9782,7 +9782,7 @@
                 <w:sz w:val="20"/>
                 <w:szCs w:val="20"/>
               </w:rPr>
-              <w:t xml:space="preserve">Recrutamento e Seleção +2; Treinamentos +1</w:t>
+              <w:t xml:space="preserve">Recrutamento +2; Treinamentos +1</w:t>
             </w:r>
           </w:p>
         </w:tc>
@@ -9832,7 +9832,7 @@
                 <w:sz w:val="20"/>
                 <w:szCs w:val="20"/>
               </w:rPr>
-              <w:t xml:space="preserve">Recrutamento e Seleção +3; Treinamentos +2; Documentos +1</w:t>
+              <w:t xml:space="preserve">Recrutamento +3; Treinamentos +2; Documentos +1</w:t>
             </w:r>
           </w:p>
         </w:tc>
@@ -11362,7 +11362,7 @@
         <w:spacing w:after="60"/>
       </w:pPr>
       <w:r>
-        <w:t xml:space="preserve">Desempate: vence o módulo pontuado por uma dor declarada na pergunta das planilhas; depois o de maior pontuação; depois a ordem fixa Colaboradores, Analítico, Suprimentos, Clientes, Documentos, Treinamentos, Chamados, Sensores, Recrutamento e Seleção, Projetos, Loyalty, Pesquisas.</w:t>
+        <w:t xml:space="preserve">Desempate: vence o módulo pontuado por uma dor declarada na pergunta das planilhas; depois o de maior pontuação; depois a ordem fixa Colaboradores, Analítico, Suprimentos, Clientes, Documentos, Treinamentos, Chamados, Sensores, Recrutamento, Projetos, Loyalty, Pesquisas.</w:t>
       </w:r>
     </w:p>
     <w:p>
@@ -12248,7 +12248,7 @@
                 <w:sz w:val="20"/>
                 <w:szCs w:val="20"/>
               </w:rPr>
-              <w:t xml:space="preserve">Recrutamento e Seleção</w:t>
+              <w:t xml:space="preserve">Recrutamento</w:t>
             </w:r>
           </w:p>
         </w:tc>

</xml_diff>